<commit_message>
Add AI & Agents skills; regenerate DOCX/PDF
</commit_message>
<xml_diff>
--- a/public/Ari-Asulin-Resume.docx
+++ b/public/Ari-Asulin-Resume.docx
@@ -34,7 +34,7 @@
       <w:pPr>
         <w:spacing w:after="160" w:before="0"/>
       </w:pPr>
-      <w:hyperlink w:history="1" r:id="rIdw-rpynxi_yppl7soumsvc">
+      <w:hyperlink w:history="1" r:id="rIdfnykgnozyqn46yoz-xnkf">
         <w:r>
           <w:rPr>
             <w:color w:val="2563EB"/>
@@ -53,7 +53,7 @@
         </w:rPr>
         <w:t xml:space="preserve">   ·   </w:t>
       </w:r>
-      <w:hyperlink w:history="1" r:id="rIde_lqxkk2eyg-p5d2fxws5">
+      <w:hyperlink w:history="1" r:id="rIdtjfzyaz3knhx2uumoekvn">
         <w:r>
           <w:rPr>
             <w:color w:val="2563EB"/>
@@ -88,7 +88,7 @@
         </w:rPr>
         <w:t xml:space="preserve">   ·   </w:t>
       </w:r>
-      <w:hyperlink w:history="1" r:id="rIdg4qgwihzl4lr_xyltuwqm">
+      <w:hyperlink w:history="1" r:id="rId20to7tezw2dxdfacvomj2">
         <w:r>
           <w:rPr>
             <w:color w:val="2563EB"/>
@@ -673,6 +673,141 @@
           <w:sz w:val="17"/>
           <w:szCs w:val="17"/>
         </w:rPr>
+        <w:t xml:space="preserve">AI &amp; Agents: </w:t>
+      </w:r>
+      <w:r>
+        <w:rPr>
+          <w:color w:val="6B7280"/>
+          <w:sz w:val="17"/>
+          <w:szCs w:val="17"/>
+        </w:rPr>
+        <w:t xml:space="preserve">GitHub Copilot (all models)</w:t>
+      </w:r>
+      <w:r>
+        <w:rPr>
+          <w:color w:val="D1D5DB"/>
+          <w:sz w:val="17"/>
+          <w:szCs w:val="17"/>
+        </w:rPr>
+        <w:t xml:space="preserve">  ·  </w:t>
+      </w:r>
+      <w:r>
+        <w:rPr>
+          <w:color w:val="6B7280"/>
+          <w:sz w:val="17"/>
+          <w:szCs w:val="17"/>
+        </w:rPr>
+        <w:t xml:space="preserve">Prompt Engineering</w:t>
+      </w:r>
+      <w:r>
+        <w:rPr>
+          <w:color w:val="D1D5DB"/>
+          <w:sz w:val="17"/>
+          <w:szCs w:val="17"/>
+        </w:rPr>
+        <w:t xml:space="preserve">  ·  </w:t>
+      </w:r>
+      <w:r>
+        <w:rPr>
+          <w:color w:val="6B7280"/>
+          <w:sz w:val="17"/>
+          <w:szCs w:val="17"/>
+        </w:rPr>
+        <w:t xml:space="preserve">Per-repo Copilot Instructions</w:t>
+      </w:r>
+      <w:r>
+        <w:rPr>
+          <w:color w:val="D1D5DB"/>
+          <w:sz w:val="17"/>
+          <w:szCs w:val="17"/>
+        </w:rPr>
+        <w:t xml:space="preserve">  ·  </w:t>
+      </w:r>
+      <w:r>
+        <w:rPr>
+          <w:color w:val="6B7280"/>
+          <w:sz w:val="17"/>
+          <w:szCs w:val="17"/>
+        </w:rPr>
+        <w:t xml:space="preserve">Agentic Data Scraping &amp; Cross-referencing</w:t>
+      </w:r>
+      <w:r>
+        <w:rPr>
+          <w:color w:val="D1D5DB"/>
+          <w:sz w:val="17"/>
+          <w:szCs w:val="17"/>
+        </w:rPr>
+        <w:t xml:space="preserve">  ·  </w:t>
+      </w:r>
+      <w:r>
+        <w:rPr>
+          <w:color w:val="6B7280"/>
+          <w:sz w:val="17"/>
+          <w:szCs w:val="17"/>
+        </w:rPr>
+        <w:t xml:space="preserve">Document &amp; Summary Generation</w:t>
+      </w:r>
+      <w:r>
+        <w:rPr>
+          <w:color w:val="D1D5DB"/>
+          <w:sz w:val="17"/>
+          <w:szCs w:val="17"/>
+        </w:rPr>
+        <w:t xml:space="preserve">  ·  </w:t>
+      </w:r>
+      <w:r>
+        <w:rPr>
+          <w:color w:val="6B7280"/>
+          <w:sz w:val="17"/>
+          <w:szCs w:val="17"/>
+        </w:rPr>
+        <w:t xml:space="preserve">Meeting Transcript Automation</w:t>
+      </w:r>
+      <w:r>
+        <w:rPr>
+          <w:color w:val="D1D5DB"/>
+          <w:sz w:val="17"/>
+          <w:szCs w:val="17"/>
+        </w:rPr>
+        <w:t xml:space="preserve">  ·  </w:t>
+      </w:r>
+      <w:r>
+        <w:rPr>
+          <w:color w:val="6B7280"/>
+          <w:sz w:val="17"/>
+          <w:szCs w:val="17"/>
+        </w:rPr>
+        <w:t xml:space="preserve">Agent-driven Infrastructure Monitoring</w:t>
+      </w:r>
+      <w:r>
+        <w:rPr>
+          <w:color w:val="D1D5DB"/>
+          <w:sz w:val="17"/>
+          <w:szCs w:val="17"/>
+        </w:rPr>
+        <w:t xml:space="preserve">  ·  </w:t>
+      </w:r>
+      <w:r>
+        <w:rPr>
+          <w:color w:val="6B7280"/>
+          <w:sz w:val="17"/>
+          <w:szCs w:val="17"/>
+        </w:rPr>
+        <w:t xml:space="preserve">Context-aware Jira Ticket Management</w:t>
+      </w:r>
+    </w:p>
+    <w:p>
+      <w:pPr>
+        <w:spacing w:after="20" w:before="60"/>
+      </w:pPr>
+      <w:r>
+        <w:rPr>
+          <w:b/>
+          <w:bCs/>
+          <w:color w:val="111827"/>
+          <w:sz w:val="17"/>
+          <w:szCs w:val="17"/>
+        </w:rPr>
         <w:t xml:space="preserve">Leadership: </w:t>
       </w:r>
       <w:r>
@@ -1188,7 +1323,7 @@
       <w:pPr>
         <w:spacing w:after="40" w:before="0"/>
       </w:pPr>
-      <w:hyperlink w:history="1" r:id="rIdnwe3s9yc4dljdnbgwjs6t">
+      <w:hyperlink w:history="1" r:id="rIdeymtf5w5wawgkrik3dnp2">
         <w:r>
           <w:rPr>
             <w:color w:val="2563EB"/>

</xml_diff>

<commit_message>
Add Jynx Younan reference; regenerate DOCX/PDF
</commit_message>
<xml_diff>
--- a/public/Ari-Asulin-Resume.docx
+++ b/public/Ari-Asulin-Resume.docx
@@ -34,7 +34,7 @@
       <w:pPr>
         <w:spacing w:after="160" w:before="0"/>
       </w:pPr>
-      <w:hyperlink w:history="1" r:id="rIdfnykgnozyqn46yoz-xnkf">
+      <w:hyperlink w:history="1" r:id="rId2hz2sfxdwstpiadf6hewc">
         <w:r>
           <w:rPr>
             <w:color w:val="2563EB"/>
@@ -53,7 +53,7 @@
         </w:rPr>
         <w:t xml:space="preserve">   ·   </w:t>
       </w:r>
-      <w:hyperlink w:history="1" r:id="rIdtjfzyaz3knhx2uumoekvn">
+      <w:hyperlink w:history="1" r:id="rIdikcont0stcbpwskvh70g8">
         <w:r>
           <w:rPr>
             <w:color w:val="2563EB"/>
@@ -88,7 +88,7 @@
         </w:rPr>
         <w:t xml:space="preserve">   ·   </w:t>
       </w:r>
-      <w:hyperlink w:history="1" r:id="rId20to7tezw2dxdfacvomj2">
+      <w:hyperlink w:history="1" r:id="rIdt-x8y-dazkqt85r_qw9o3">
         <w:r>
           <w:rPr>
             <w:color w:val="2563EB"/>
@@ -1294,7 +1294,7 @@
           <w:sz w:val="24"/>
           <w:szCs w:val="24"/>
         </w:rPr>
-        <w:t xml:space="preserve">PROFESSIONAL REFERENCE</w:t>
+        <w:t xml:space="preserve">PROFESSIONAL REFERENCES</w:t>
       </w:r>
     </w:p>
     <w:p>
@@ -1308,6 +1308,60 @@
           <w:sz w:val="20"/>
           <w:szCs w:val="20"/>
         </w:rPr>
+        <w:t xml:space="preserve">Jynx Younan</w:t>
+      </w:r>
+      <w:r>
+        <w:rPr>
+          <w:color w:val="6B7280"/>
+          <w:sz w:val="18"/>
+          <w:szCs w:val="18"/>
+        </w:rPr>
+        <w:t xml:space="preserve">  —  Agile People Leader @ University of Phoenix</w:t>
+      </w:r>
+    </w:p>
+    <w:p>
+      <w:pPr>
+        <w:spacing w:after="80" w:before="0"/>
+      </w:pPr>
+      <w:hyperlink w:history="1" r:id="rId44unpmlxku_yt6rskwe2d">
+        <w:r>
+          <w:rPr>
+            <w:color w:val="2563EB"/>
+            <w:sz w:val="18"/>
+            <w:szCs w:val="18"/>
+            <w:u w:val="single"/>
+          </w:rPr>
+          <w:t xml:space="preserve">Jynx.Younan@phoenix.edu</w:t>
+        </w:r>
+      </w:hyperlink>
+      <w:r>
+        <w:rPr>
+          <w:color w:val="6B7280"/>
+          <w:sz w:val="18"/>
+          <w:szCs w:val="18"/>
+        </w:rPr>
+        <w:t xml:space="preserve">   ·   </w:t>
+      </w:r>
+      <w:r>
+        <w:rPr>
+          <w:color w:val="6B7280"/>
+          <w:sz w:val="18"/>
+          <w:szCs w:val="18"/>
+        </w:rPr>
+        <w:t xml:space="preserve">602-557-1090</w:t>
+      </w:r>
+    </w:p>
+    <w:p>
+      <w:pPr>
+        <w:spacing w:after="20" w:before="80"/>
+      </w:pPr>
+      <w:r>
+        <w:rPr>
+          <w:b/>
+          <w:bCs/>
+          <w:sz w:val="20"/>
+          <w:szCs w:val="20"/>
+        </w:rPr>
         <w:t xml:space="preserve">Mike McDonald</w:t>
       </w:r>
       <w:r>
@@ -1323,7 +1377,7 @@
       <w:pPr>
         <w:spacing w:after="40" w:before="0"/>
       </w:pPr>
-      <w:hyperlink w:history="1" r:id="rIdeymtf5w5wawgkrik3dnp2">
+      <w:hyperlink w:history="1" r:id="rId04jdg7cundd3hcyvawtv7">
         <w:r>
           <w:rPr>
             <w:color w:val="2563EB"/>

</xml_diff>

<commit_message>
chore: refresh resume PDF/DOCX without UOPX reference
</commit_message>
<xml_diff>
--- a/public/Ari-Asulin-Resume.docx
+++ b/public/Ari-Asulin-Resume.docx
@@ -34,7 +34,7 @@
       <w:pPr>
         <w:spacing w:after="160" w:before="0"/>
       </w:pPr>
-      <w:hyperlink w:history="1" r:id="rId2hz2sfxdwstpiadf6hewc">
+      <w:hyperlink w:history="1" r:id="rIdjknurwnuchvs_qzrdqrvw">
         <w:r>
           <w:rPr>
             <w:color w:val="2563EB"/>
@@ -53,7 +53,7 @@
         </w:rPr>
         <w:t xml:space="preserve">   ·   </w:t>
       </w:r>
-      <w:hyperlink w:history="1" r:id="rIdikcont0stcbpwskvh70g8">
+      <w:hyperlink w:history="1" r:id="rIdlbbvhmykxxmrmdxbis39q">
         <w:r>
           <w:rPr>
             <w:color w:val="2563EB"/>
@@ -88,7 +88,7 @@
         </w:rPr>
         <w:t xml:space="preserve">   ·   </w:t>
       </w:r>
-      <w:hyperlink w:history="1" r:id="rIdt-x8y-dazkqt85r_qw9o3">
+      <w:hyperlink w:history="1" r:id="rId7sswa-o1gytmjewaujzcq">
         <w:r>
           <w:rPr>
             <w:color w:val="2563EB"/>
@@ -112,7 +112,7 @@
           <w:sz w:val="19"/>
           <w:szCs w:val="19"/>
         </w:rPr>
-        <w:t xml:space="preserve">Full-stack developer with 18+ years of experience building production applications across web, mobile, and cloud platforms. Known for translating complex technical requirements into clear plans, bridging communication between engineering and stakeholders, and steering teams through delivery with honesty and accountability.</w:t>
+        <w:t xml:space="preserve">I build free, high-performance open-source software. Full-stack engineer with 18+ years of industry experience — equally at home in teams and working independently. Programming is a craft that rewards a creative mind. My work spans Relay, music tools, and interactive narrative.</w:t>
       </w:r>
     </w:p>
     <w:p>
@@ -1308,60 +1308,6 @@
           <w:sz w:val="20"/>
           <w:szCs w:val="20"/>
         </w:rPr>
-        <w:t xml:space="preserve">Jynx Younan</w:t>
-      </w:r>
-      <w:r>
-        <w:rPr>
-          <w:color w:val="6B7280"/>
-          <w:sz w:val="18"/>
-          <w:szCs w:val="18"/>
-        </w:rPr>
-        <w:t xml:space="preserve">  —  Agile People Leader @ University of Phoenix</w:t>
-      </w:r>
-    </w:p>
-    <w:p>
-      <w:pPr>
-        <w:spacing w:after="80" w:before="0"/>
-      </w:pPr>
-      <w:hyperlink w:history="1" r:id="rId44unpmlxku_yt6rskwe2d">
-        <w:r>
-          <w:rPr>
-            <w:color w:val="2563EB"/>
-            <w:sz w:val="18"/>
-            <w:szCs w:val="18"/>
-            <w:u w:val="single"/>
-          </w:rPr>
-          <w:t xml:space="preserve">Jynx.Younan@phoenix.edu</w:t>
-        </w:r>
-      </w:hyperlink>
-      <w:r>
-        <w:rPr>
-          <w:color w:val="6B7280"/>
-          <w:sz w:val="18"/>
-          <w:szCs w:val="18"/>
-        </w:rPr>
-        <w:t xml:space="preserve">   ·   </w:t>
-      </w:r>
-      <w:r>
-        <w:rPr>
-          <w:color w:val="6B7280"/>
-          <w:sz w:val="18"/>
-          <w:szCs w:val="18"/>
-        </w:rPr>
-        <w:t xml:space="preserve">602-557-1090</w:t>
-      </w:r>
-    </w:p>
-    <w:p>
-      <w:pPr>
-        <w:spacing w:after="20" w:before="80"/>
-      </w:pPr>
-      <w:r>
-        <w:rPr>
-          <w:b/>
-          <w:bCs/>
-          <w:sz w:val="20"/>
-          <w:szCs w:val="20"/>
-        </w:rPr>
         <w:t xml:space="preserve">Mike McDonald</w:t>
       </w:r>
       <w:r>
@@ -1377,7 +1323,7 @@
       <w:pPr>
         <w:spacing w:after="40" w:before="0"/>
       </w:pPr>
-      <w:hyperlink w:history="1" r:id="rId04jdg7cundd3hcyvawtv7">
+      <w:hyperlink w:history="1" r:id="rIdsasihdo951du6aqtwy2rt">
         <w:r>
           <w:rPr>
             <w:color w:val="2563EB"/>

</xml_diff>